<commit_message>
Update Flowchart and documents
</commit_message>
<xml_diff>
--- a/Documents/FinalProject_C1_Group04.docx
+++ b/Documents/FinalProject_C1_Group04.docx
@@ -756,7 +756,7 @@
       <w:r>
         <w:fldChar w:fldCharType="separate"/>
       </w:r>
-      <w:hyperlink w:anchor="_Toc189816919" w:history="1">
+      <w:hyperlink w:anchor="_Toc190072618" w:history="1">
         <w:r>
           <w:rPr>
             <w:rStyle w:val="Hyperlink"/>
@@ -800,7 +800,7 @@
             <w:noProof/>
             <w:webHidden/>
           </w:rPr>
-          <w:instrText xml:space="preserve"> PAGEREF _Toc189816919 \h </w:instrText>
+          <w:instrText xml:space="preserve"> PAGEREF _Toc190072618 \h </w:instrText>
         </w:r>
         <w:r>
           <w:rPr>
@@ -844,7 +844,7 @@
           <w:szCs w:val="39"/>
         </w:rPr>
       </w:pPr>
-      <w:hyperlink w:anchor="_Toc189816920" w:history="1">
+      <w:hyperlink w:anchor="_Toc190072619" w:history="1">
         <w:r>
           <w:rPr>
             <w:rStyle w:val="Hyperlink"/>
@@ -886,7 +886,7 @@
             <w:noProof/>
             <w:webHidden/>
           </w:rPr>
-          <w:instrText xml:space="preserve"> PAGEREF _Toc189816920 \h </w:instrText>
+          <w:instrText xml:space="preserve"> PAGEREF _Toc190072619 \h </w:instrText>
         </w:r>
         <w:r>
           <w:rPr>
@@ -930,7 +930,7 @@
           <w:szCs w:val="39"/>
         </w:rPr>
       </w:pPr>
-      <w:hyperlink w:anchor="_Toc189816921" w:history="1">
+      <w:hyperlink w:anchor="_Toc190072620" w:history="1">
         <w:r>
           <w:rPr>
             <w:rStyle w:val="Hyperlink"/>
@@ -972,7 +972,7 @@
             <w:noProof/>
             <w:webHidden/>
           </w:rPr>
-          <w:instrText xml:space="preserve"> PAGEREF _Toc189816921 \h </w:instrText>
+          <w:instrText xml:space="preserve"> PAGEREF _Toc190072620 \h </w:instrText>
         </w:r>
         <w:r>
           <w:rPr>
@@ -1014,7 +1014,7 @@
           <w:szCs w:val="39"/>
         </w:rPr>
       </w:pPr>
-      <w:hyperlink w:anchor="_Toc189816922" w:history="1">
+      <w:hyperlink w:anchor="_Toc190072621" w:history="1">
         <w:r>
           <w:rPr>
             <w:rStyle w:val="Hyperlink"/>
@@ -1058,7 +1058,7 @@
             <w:noProof/>
             <w:webHidden/>
           </w:rPr>
-          <w:instrText xml:space="preserve"> PAGEREF _Toc189816922 \h </w:instrText>
+          <w:instrText xml:space="preserve"> PAGEREF _Toc190072621 \h </w:instrText>
         </w:r>
         <w:r>
           <w:rPr>
@@ -1102,7 +1102,7 @@
           <w:szCs w:val="39"/>
         </w:rPr>
       </w:pPr>
-      <w:hyperlink w:anchor="_Toc189816923" w:history="1">
+      <w:hyperlink w:anchor="_Toc190072622" w:history="1">
         <w:r>
           <w:rPr>
             <w:rStyle w:val="Hyperlink"/>
@@ -1144,7 +1144,7 @@
             <w:noProof/>
             <w:webHidden/>
           </w:rPr>
-          <w:instrText xml:space="preserve"> PAGEREF _Toc189816923 \h </w:instrText>
+          <w:instrText xml:space="preserve"> PAGEREF _Toc190072622 \h </w:instrText>
         </w:r>
         <w:r>
           <w:rPr>
@@ -1188,7 +1188,7 @@
           <w:szCs w:val="39"/>
         </w:rPr>
       </w:pPr>
-      <w:hyperlink w:anchor="_Toc189816924" w:history="1">
+      <w:hyperlink w:anchor="_Toc190072623" w:history="1">
         <w:r>
           <w:rPr>
             <w:rStyle w:val="Hyperlink"/>
@@ -1230,7 +1230,7 @@
             <w:noProof/>
             <w:webHidden/>
           </w:rPr>
-          <w:instrText xml:space="preserve"> PAGEREF _Toc189816924 \h </w:instrText>
+          <w:instrText xml:space="preserve"> PAGEREF _Toc190072623 \h </w:instrText>
         </w:r>
         <w:r>
           <w:rPr>
@@ -1272,7 +1272,7 @@
           <w:szCs w:val="39"/>
         </w:rPr>
       </w:pPr>
-      <w:hyperlink w:anchor="_Toc189816925" w:history="1">
+      <w:hyperlink w:anchor="_Toc190072624" w:history="1">
         <w:r>
           <w:rPr>
             <w:rStyle w:val="Hyperlink"/>
@@ -1316,7 +1316,7 @@
             <w:noProof/>
             <w:webHidden/>
           </w:rPr>
-          <w:instrText xml:space="preserve"> PAGEREF _Toc189816925 \h </w:instrText>
+          <w:instrText xml:space="preserve"> PAGEREF _Toc190072624 \h </w:instrText>
         </w:r>
         <w:r>
           <w:rPr>
@@ -1360,7 +1360,7 @@
           <w:szCs w:val="39"/>
         </w:rPr>
       </w:pPr>
-      <w:hyperlink w:anchor="_Toc189816926" w:history="1">
+      <w:hyperlink w:anchor="_Toc190072625" w:history="1">
         <w:r>
           <w:rPr>
             <w:rStyle w:val="Hyperlink"/>
@@ -1402,7 +1402,7 @@
             <w:noProof/>
             <w:webHidden/>
           </w:rPr>
-          <w:instrText xml:space="preserve"> PAGEREF _Toc189816926 \h </w:instrText>
+          <w:instrText xml:space="preserve"> PAGEREF _Toc190072625 \h </w:instrText>
         </w:r>
         <w:r>
           <w:rPr>
@@ -1446,7 +1446,7 @@
           <w:szCs w:val="39"/>
         </w:rPr>
       </w:pPr>
-      <w:hyperlink w:anchor="_Toc189816927" w:history="1">
+      <w:hyperlink w:anchor="_Toc190072626" w:history="1">
         <w:r>
           <w:rPr>
             <w:rStyle w:val="Hyperlink"/>
@@ -1488,7 +1488,7 @@
             <w:noProof/>
             <w:webHidden/>
           </w:rPr>
-          <w:instrText xml:space="preserve"> PAGEREF _Toc189816927 \h </w:instrText>
+          <w:instrText xml:space="preserve"> PAGEREF _Toc190072626 \h </w:instrText>
         </w:r>
         <w:r>
           <w:rPr>
@@ -1533,7 +1533,7 @@
           <w:szCs w:val="39"/>
         </w:rPr>
       </w:pPr>
-      <w:hyperlink w:anchor="_Toc189816928" w:history="1">
+      <w:hyperlink w:anchor="_Toc190072627" w:history="1">
         <w:r>
           <w:rPr>
             <w:rStyle w:val="Hyperlink"/>
@@ -1576,7 +1576,7 @@
             <w:noProof/>
             <w:webHidden/>
           </w:rPr>
-          <w:instrText xml:space="preserve"> PAGEREF _Toc189816928 \h </w:instrText>
+          <w:instrText xml:space="preserve"> PAGEREF _Toc190072627 \h </w:instrText>
         </w:r>
         <w:r>
           <w:rPr>
@@ -1621,7 +1621,7 @@
           <w:szCs w:val="39"/>
         </w:rPr>
       </w:pPr>
-      <w:hyperlink w:anchor="_Toc189816929" w:history="1">
+      <w:hyperlink w:anchor="_Toc190072628" w:history="1">
         <w:r>
           <w:rPr>
             <w:rStyle w:val="Hyperlink"/>
@@ -1664,7 +1664,7 @@
             <w:noProof/>
             <w:webHidden/>
           </w:rPr>
-          <w:instrText xml:space="preserve"> PAGEREF _Toc189816929 \h </w:instrText>
+          <w:instrText xml:space="preserve"> PAGEREF _Toc190072628 \h </w:instrText>
         </w:r>
         <w:r>
           <w:rPr>
@@ -1697,6 +1697,94 @@
     </w:p>
     <w:p>
       <w:pPr>
+        <w:pStyle w:val="TOC3"/>
+        <w:tabs>
+          <w:tab w:val="left" w:pos="1440"/>
+          <w:tab w:val="right" w:leader="dot" w:pos="9016"/>
+        </w:tabs>
+        <w:rPr>
+          <w:rFonts w:asciiTheme="minorHAnsi" w:eastAsiaTheme="minorEastAsia" w:hAnsiTheme="minorHAnsi" w:cstheme="minorBidi"/>
+          <w:iCs w:val="0"/>
+          <w:noProof/>
+          <w:szCs w:val="39"/>
+        </w:rPr>
+      </w:pPr>
+      <w:hyperlink w:anchor="_Toc190072629" w:history="1">
+        <w:r>
+          <w:rPr>
+            <w:rStyle w:val="Hyperlink"/>
+            <w:noProof/>
+          </w:rPr>
+          <w:t>3.2.3</w:t>
+        </w:r>
+        <w:r>
+          <w:rPr>
+            <w:rFonts w:asciiTheme="minorHAnsi" w:eastAsiaTheme="minorEastAsia" w:hAnsiTheme="minorHAnsi" w:cstheme="minorBidi"/>
+            <w:iCs w:val="0"/>
+            <w:noProof/>
+            <w:szCs w:val="39"/>
+          </w:rPr>
+          <w:tab/>
+        </w:r>
+        <w:r>
+          <w:rPr>
+            <w:rStyle w:val="Hyperlink"/>
+            <w:noProof/>
+          </w:rPr>
+          <w:t>zener.h</w:t>
+        </w:r>
+        <w:r>
+          <w:rPr>
+            <w:noProof/>
+            <w:webHidden/>
+          </w:rPr>
+          <w:tab/>
+        </w:r>
+        <w:r>
+          <w:rPr>
+            <w:noProof/>
+            <w:webHidden/>
+          </w:rPr>
+          <w:fldChar w:fldCharType="begin"/>
+        </w:r>
+        <w:r>
+          <w:rPr>
+            <w:noProof/>
+            <w:webHidden/>
+          </w:rPr>
+          <w:instrText xml:space="preserve"> PAGEREF _Toc190072629 \h </w:instrText>
+        </w:r>
+        <w:r>
+          <w:rPr>
+            <w:noProof/>
+            <w:webHidden/>
+          </w:rPr>
+        </w:r>
+        <w:r>
+          <w:rPr>
+            <w:noProof/>
+            <w:webHidden/>
+          </w:rPr>
+          <w:fldChar w:fldCharType="separate"/>
+        </w:r>
+        <w:r>
+          <w:rPr>
+            <w:noProof/>
+            <w:webHidden/>
+          </w:rPr>
+          <w:t>5</w:t>
+        </w:r>
+        <w:r>
+          <w:rPr>
+            <w:noProof/>
+            <w:webHidden/>
+          </w:rPr>
+          <w:fldChar w:fldCharType="end"/>
+        </w:r>
+      </w:hyperlink>
+    </w:p>
+    <w:p>
+      <w:pPr>
         <w:pStyle w:val="TOC2"/>
         <w:tabs>
           <w:tab w:val="left" w:pos="960"/>
@@ -1708,7 +1796,7 @@
           <w:szCs w:val="39"/>
         </w:rPr>
       </w:pPr>
-      <w:hyperlink w:anchor="_Toc189816930" w:history="1">
+      <w:hyperlink w:anchor="_Toc190072630" w:history="1">
         <w:r>
           <w:rPr>
             <w:rStyle w:val="Hyperlink"/>
@@ -1750,7 +1838,7 @@
             <w:noProof/>
             <w:webHidden/>
           </w:rPr>
-          <w:instrText xml:space="preserve"> PAGEREF _Toc189816930 \h </w:instrText>
+          <w:instrText xml:space="preserve"> PAGEREF _Toc190072630 \h </w:instrText>
         </w:r>
         <w:r>
           <w:rPr>
@@ -1770,7 +1858,7 @@
             <w:noProof/>
             <w:webHidden/>
           </w:rPr>
-          <w:t>5</w:t>
+          <w:t>6</w:t>
         </w:r>
         <w:r>
           <w:rPr>
@@ -1795,7 +1883,7 @@
           <w:szCs w:val="39"/>
         </w:rPr>
       </w:pPr>
-      <w:hyperlink w:anchor="_Toc189816931" w:history="1">
+      <w:hyperlink w:anchor="_Toc190072631" w:history="1">
         <w:r>
           <w:rPr>
             <w:rStyle w:val="Hyperlink"/>
@@ -1838,7 +1926,7 @@
             <w:noProof/>
             <w:webHidden/>
           </w:rPr>
-          <w:instrText xml:space="preserve"> PAGEREF _Toc189816931 \h </w:instrText>
+          <w:instrText xml:space="preserve"> PAGEREF _Toc190072631 \h </w:instrText>
         </w:r>
         <w:r>
           <w:rPr>
@@ -1858,7 +1946,7 @@
             <w:noProof/>
             <w:webHidden/>
           </w:rPr>
-          <w:t>5</w:t>
+          <w:t>6</w:t>
         </w:r>
         <w:r>
           <w:rPr>
@@ -1883,7 +1971,7 @@
           <w:szCs w:val="39"/>
         </w:rPr>
       </w:pPr>
-      <w:hyperlink w:anchor="_Toc189816932" w:history="1">
+      <w:hyperlink w:anchor="_Toc190072632" w:history="1">
         <w:r>
           <w:rPr>
             <w:rStyle w:val="Hyperlink"/>
@@ -1926,7 +2014,7 @@
             <w:noProof/>
             <w:webHidden/>
           </w:rPr>
-          <w:instrText xml:space="preserve"> PAGEREF _Toc189816932 \h </w:instrText>
+          <w:instrText xml:space="preserve"> PAGEREF _Toc190072632 \h </w:instrText>
         </w:r>
         <w:r>
           <w:rPr>
@@ -1946,7 +2034,7 @@
             <w:noProof/>
             <w:webHidden/>
           </w:rPr>
-          <w:t>7</w:t>
+          <w:t>8</w:t>
         </w:r>
         <w:r>
           <w:rPr>
@@ -1970,7 +2058,7 @@
           <w:szCs w:val="39"/>
         </w:rPr>
       </w:pPr>
-      <w:hyperlink w:anchor="_Toc189816933" w:history="1">
+      <w:hyperlink w:anchor="_Toc190072633" w:history="1">
         <w:r>
           <w:rPr>
             <w:rStyle w:val="Hyperlink"/>
@@ -2012,7 +2100,7 @@
             <w:noProof/>
             <w:webHidden/>
           </w:rPr>
-          <w:instrText xml:space="preserve"> PAGEREF _Toc189816933 \h </w:instrText>
+          <w:instrText xml:space="preserve"> PAGEREF _Toc190072633 \h </w:instrText>
         </w:r>
         <w:r>
           <w:rPr>
@@ -2032,7 +2120,7 @@
             <w:noProof/>
             <w:webHidden/>
           </w:rPr>
-          <w:t>8</w:t>
+          <w:t>10</w:t>
         </w:r>
         <w:r>
           <w:rPr>
@@ -2056,7 +2144,7 @@
           <w:szCs w:val="39"/>
         </w:rPr>
       </w:pPr>
-      <w:hyperlink w:anchor="_Toc189816934" w:history="1">
+      <w:hyperlink w:anchor="_Toc190072634" w:history="1">
         <w:r>
           <w:rPr>
             <w:rStyle w:val="Hyperlink"/>
@@ -2098,7 +2186,7 @@
             <w:noProof/>
             <w:webHidden/>
           </w:rPr>
-          <w:instrText xml:space="preserve"> PAGEREF _Toc189816934 \h </w:instrText>
+          <w:instrText xml:space="preserve"> PAGEREF _Toc190072634 \h </w:instrText>
         </w:r>
         <w:r>
           <w:rPr>
@@ -2118,7 +2206,7 @@
             <w:noProof/>
             <w:webHidden/>
           </w:rPr>
-          <w:t>8</w:t>
+          <w:t>13</w:t>
         </w:r>
         <w:r>
           <w:rPr>
@@ -2142,7 +2230,7 @@
           <w:szCs w:val="39"/>
         </w:rPr>
       </w:pPr>
-      <w:hyperlink w:anchor="_Toc189816935" w:history="1">
+      <w:hyperlink w:anchor="_Toc190072635" w:history="1">
         <w:r>
           <w:rPr>
             <w:rStyle w:val="Hyperlink"/>
@@ -2184,7 +2272,7 @@
             <w:noProof/>
             <w:webHidden/>
           </w:rPr>
-          <w:instrText xml:space="preserve"> PAGEREF _Toc189816935 \h </w:instrText>
+          <w:instrText xml:space="preserve"> PAGEREF _Toc190072635 \h </w:instrText>
         </w:r>
         <w:r>
           <w:rPr>
@@ -2204,7 +2292,7 @@
             <w:noProof/>
             <w:webHidden/>
           </w:rPr>
-          <w:t>12</w:t>
+          <w:t>13</w:t>
         </w:r>
         <w:r>
           <w:rPr>
@@ -2226,7 +2314,7 @@
           <w:szCs w:val="39"/>
         </w:rPr>
       </w:pPr>
-      <w:hyperlink w:anchor="_Toc189816936" w:history="1">
+      <w:hyperlink w:anchor="_Toc190072636" w:history="1">
         <w:r>
           <w:rPr>
             <w:rStyle w:val="Hyperlink"/>
@@ -2270,7 +2358,7 @@
             <w:noProof/>
             <w:webHidden/>
           </w:rPr>
-          <w:instrText xml:space="preserve"> PAGEREF _Toc189816936 \h </w:instrText>
+          <w:instrText xml:space="preserve"> PAGEREF _Toc190072636 \h </w:instrText>
         </w:r>
         <w:r>
           <w:rPr>
@@ -2290,7 +2378,7 @@
             <w:noProof/>
             <w:webHidden/>
           </w:rPr>
-          <w:t>12</w:t>
+          <w:t>14</w:t>
         </w:r>
         <w:r>
           <w:rPr>
@@ -2312,7 +2400,7 @@
           <w:szCs w:val="39"/>
         </w:rPr>
       </w:pPr>
-      <w:hyperlink w:anchor="_Toc189816937" w:history="1">
+      <w:hyperlink w:anchor="_Toc190072637" w:history="1">
         <w:r>
           <w:rPr>
             <w:rStyle w:val="Hyperlink"/>
@@ -2356,7 +2444,7 @@
             <w:noProof/>
             <w:webHidden/>
           </w:rPr>
-          <w:instrText xml:space="preserve"> PAGEREF _Toc189816937 \h </w:instrText>
+          <w:instrText xml:space="preserve"> PAGEREF _Toc190072637 \h </w:instrText>
         </w:r>
         <w:r>
           <w:rPr>
@@ -2376,7 +2464,7 @@
             <w:noProof/>
             <w:webHidden/>
           </w:rPr>
-          <w:t>14</w:t>
+          <w:t>16</w:t>
         </w:r>
         <w:r>
           <w:rPr>
@@ -2398,13 +2486,99 @@
           <w:szCs w:val="39"/>
         </w:rPr>
       </w:pPr>
-      <w:hyperlink w:anchor="_Toc189816938" w:history="1">
+      <w:hyperlink w:anchor="_Toc190072638" w:history="1">
         <w:r>
           <w:rPr>
             <w:rStyle w:val="Hyperlink"/>
             <w:noProof/>
           </w:rPr>
           <w:t>6</w:t>
+        </w:r>
+        <w:r>
+          <w:rPr>
+            <w:rFonts w:asciiTheme="minorHAnsi" w:eastAsiaTheme="minorEastAsia" w:hAnsiTheme="minorHAnsi" w:cstheme="minorBidi"/>
+            <w:b w:val="0"/>
+            <w:bCs w:val="0"/>
+            <w:noProof/>
+            <w:szCs w:val="39"/>
+          </w:rPr>
+          <w:tab/>
+        </w:r>
+        <w:r>
+          <w:rPr>
+            <w:rStyle w:val="Hyperlink"/>
+            <w:noProof/>
+          </w:rPr>
+          <w:t>GitHub</w:t>
+        </w:r>
+        <w:r>
+          <w:rPr>
+            <w:noProof/>
+            <w:webHidden/>
+          </w:rPr>
+          <w:tab/>
+        </w:r>
+        <w:r>
+          <w:rPr>
+            <w:noProof/>
+            <w:webHidden/>
+          </w:rPr>
+          <w:fldChar w:fldCharType="begin"/>
+        </w:r>
+        <w:r>
+          <w:rPr>
+            <w:noProof/>
+            <w:webHidden/>
+          </w:rPr>
+          <w:instrText xml:space="preserve"> PAGEREF _Toc190072638 \h </w:instrText>
+        </w:r>
+        <w:r>
+          <w:rPr>
+            <w:noProof/>
+            <w:webHidden/>
+          </w:rPr>
+        </w:r>
+        <w:r>
+          <w:rPr>
+            <w:noProof/>
+            <w:webHidden/>
+          </w:rPr>
+          <w:fldChar w:fldCharType="separate"/>
+        </w:r>
+        <w:r>
+          <w:rPr>
+            <w:noProof/>
+            <w:webHidden/>
+          </w:rPr>
+          <w:t>16</w:t>
+        </w:r>
+        <w:r>
+          <w:rPr>
+            <w:noProof/>
+            <w:webHidden/>
+          </w:rPr>
+          <w:fldChar w:fldCharType="end"/>
+        </w:r>
+      </w:hyperlink>
+    </w:p>
+    <w:p>
+      <w:pPr>
+        <w:pStyle w:val="TOC1"/>
+        <w:rPr>
+          <w:rFonts w:asciiTheme="minorHAnsi" w:eastAsiaTheme="minorEastAsia" w:hAnsiTheme="minorHAnsi" w:cstheme="minorBidi"/>
+          <w:b w:val="0"/>
+          <w:bCs w:val="0"/>
+          <w:noProof/>
+          <w:szCs w:val="39"/>
+        </w:rPr>
+      </w:pPr>
+      <w:hyperlink w:anchor="_Toc190072639" w:history="1">
+        <w:r>
+          <w:rPr>
+            <w:rStyle w:val="Hyperlink"/>
+            <w:noProof/>
+          </w:rPr>
+          <w:t>7</w:t>
         </w:r>
         <w:r>
           <w:rPr>
@@ -2442,7 +2616,7 @@
             <w:noProof/>
             <w:webHidden/>
           </w:rPr>
-          <w:instrText xml:space="preserve"> PAGEREF _Toc189816938 \h </w:instrText>
+          <w:instrText xml:space="preserve"> PAGEREF _Toc190072639 \h </w:instrText>
         </w:r>
         <w:r>
           <w:rPr>
@@ -2462,7 +2636,7 @@
             <w:noProof/>
             <w:webHidden/>
           </w:rPr>
-          <w:t>14</w:t>
+          <w:t>16</w:t>
         </w:r>
         <w:r>
           <w:rPr>
@@ -2494,7 +2668,7 @@
       <w:pPr>
         <w:pStyle w:val="Heading1"/>
       </w:pPr>
-      <w:bookmarkStart w:id="0" w:name="_Toc189816919"/>
+      <w:bookmarkStart w:id="0" w:name="_Toc190072618"/>
       <w:r>
         <w:lastRenderedPageBreak/>
         <w:t>Introduction</w:t>
@@ -2505,7 +2679,7 @@
       <w:pPr>
         <w:pStyle w:val="Heading2"/>
       </w:pPr>
-      <w:bookmarkStart w:id="1" w:name="_Toc189816920"/>
+      <w:bookmarkStart w:id="1" w:name="_Toc190072619"/>
       <w:r>
         <w:t>Background of the Problem</w:t>
       </w:r>
@@ -3350,7 +3524,7 @@
       <w:pPr>
         <w:pStyle w:val="Heading2"/>
       </w:pPr>
-      <w:bookmarkStart w:id="2" w:name="_Toc189816921"/>
+      <w:bookmarkStart w:id="2" w:name="_Toc190072620"/>
       <w:r>
         <w:lastRenderedPageBreak/>
         <w:t>Rationale for Selecting the Problem</w:t>
@@ -3447,7 +3621,7 @@
       <w:pPr>
         <w:pStyle w:val="Heading1"/>
       </w:pPr>
-      <w:bookmarkStart w:id="3" w:name="_Toc189816922"/>
+      <w:bookmarkStart w:id="3" w:name="_Toc190072621"/>
       <w:r>
         <w:t xml:space="preserve">Objective of </w:t>
       </w:r>
@@ -3463,7 +3637,7 @@
       <w:pPr>
         <w:pStyle w:val="Heading2"/>
       </w:pPr>
-      <w:bookmarkStart w:id="4" w:name="_Toc189816923"/>
+      <w:bookmarkStart w:id="4" w:name="_Toc190072622"/>
       <w:r>
         <w:t>Objective</w:t>
       </w:r>
@@ -3493,7 +3667,7 @@
       <w:pPr>
         <w:pStyle w:val="Heading2"/>
       </w:pPr>
-      <w:bookmarkStart w:id="5" w:name="_Toc189816924"/>
+      <w:bookmarkStart w:id="5" w:name="_Toc190072623"/>
       <w:r>
         <w:t>Scope</w:t>
       </w:r>
@@ -3601,7 +3775,7 @@
       <w:pPr>
         <w:pStyle w:val="Heading1"/>
       </w:pPr>
-      <w:bookmarkStart w:id="6" w:name="_Toc189816925"/>
+      <w:bookmarkStart w:id="6" w:name="_Toc190072624"/>
       <w:r>
         <w:t>Methodology</w:t>
       </w:r>
@@ -3611,7 +3785,7 @@
       <w:pPr>
         <w:pStyle w:val="Heading2"/>
       </w:pPr>
-      <w:bookmarkStart w:id="7" w:name="_Toc189816926"/>
+      <w:bookmarkStart w:id="7" w:name="_Toc190072625"/>
       <w:r>
         <w:t>Materials</w:t>
       </w:r>
@@ -3685,7 +3859,7 @@
       <w:pPr>
         <w:pStyle w:val="Heading2"/>
       </w:pPr>
-      <w:bookmarkStart w:id="8" w:name="_Toc189816927"/>
+      <w:bookmarkStart w:id="8" w:name="_Toc190072626"/>
       <w:r>
         <w:t>Final Project</w:t>
       </w:r>
@@ -3701,7 +3875,7 @@
       <w:pPr>
         <w:pStyle w:val="Heading3"/>
       </w:pPr>
-      <w:bookmarkStart w:id="9" w:name="_Toc189816928"/>
+      <w:bookmarkStart w:id="9" w:name="_Toc190072627"/>
       <w:r>
         <w:t>main.c</w:t>
       </w:r>
@@ -4275,7 +4449,7 @@
       <w:pPr>
         <w:pStyle w:val="Heading3"/>
       </w:pPr>
-      <w:bookmarkStart w:id="10" w:name="_Toc189816929"/>
+      <w:bookmarkStart w:id="10" w:name="_Toc190072628"/>
       <w:proofErr w:type="spellStart"/>
       <w:r>
         <w:t>zener.c</w:t>
@@ -5287,10 +5461,12 @@
       <w:pPr>
         <w:pStyle w:val="Heading3"/>
       </w:pPr>
+      <w:bookmarkStart w:id="11" w:name="_Toc190072629"/>
       <w:proofErr w:type="spellStart"/>
       <w:r>
         <w:t>zener.h</w:t>
       </w:r>
+      <w:bookmarkEnd w:id="11"/>
       <w:proofErr w:type="spellEnd"/>
     </w:p>
     <w:p>
@@ -5353,24 +5529,25 @@
       <w:pPr>
         <w:pStyle w:val="Heading2"/>
       </w:pPr>
-      <w:bookmarkStart w:id="11" w:name="_Toc189816930"/>
-      <w:r>
+      <w:bookmarkStart w:id="12" w:name="_Toc190072630"/>
+      <w:r>
+        <w:lastRenderedPageBreak/>
         <w:t>Final</w:t>
       </w:r>
       <w:r>
         <w:t xml:space="preserve"> Project Flowchart</w:t>
       </w:r>
-      <w:bookmarkEnd w:id="11"/>
+      <w:bookmarkEnd w:id="12"/>
     </w:p>
     <w:p>
       <w:pPr>
         <w:pStyle w:val="Heading3"/>
       </w:pPr>
-      <w:bookmarkStart w:id="12" w:name="_Toc189816931"/>
+      <w:bookmarkStart w:id="13" w:name="_Toc190072631"/>
       <w:r>
         <w:t>main.c</w:t>
       </w:r>
-      <w:bookmarkEnd w:id="12"/>
+      <w:bookmarkEnd w:id="13"/>
     </w:p>
     <w:p>
       <w:pPr>
@@ -5382,10 +5559,10 @@
           <w:noProof/>
         </w:rPr>
         <w:drawing>
-          <wp:inline distT="0" distB="0" distL="0" distR="0" wp14:anchorId="15AE86EB" wp14:editId="72CBB73E">
-            <wp:extent cx="4720605" cy="3699934"/>
-            <wp:effectExtent l="0" t="0" r="3810" b="0"/>
-            <wp:docPr id="1775250087" name="Picture 1"/>
+          <wp:inline distT="0" distB="0" distL="0" distR="0" wp14:anchorId="7769435B" wp14:editId="6E46A8F1">
+            <wp:extent cx="5731510" cy="4279265"/>
+            <wp:effectExtent l="0" t="0" r="2540" b="6985"/>
+            <wp:docPr id="1603986936" name="Picture 1" descr="A screenshot of a computer screen&#10;&#10;AI-generated content may be incorrect."/>
             <wp:cNvGraphicFramePr>
               <a:graphicFrameLocks xmlns:a="http://schemas.openxmlformats.org/drawingml/2006/main" noChangeAspect="1"/>
             </wp:cNvGraphicFramePr>
@@ -5393,7 +5570,7 @@
               <a:graphicData uri="http://schemas.openxmlformats.org/drawingml/2006/picture">
                 <pic:pic xmlns:pic="http://schemas.openxmlformats.org/drawingml/2006/picture">
                   <pic:nvPicPr>
-                    <pic:cNvPr id="1775250087" name="Picture 1"/>
+                    <pic:cNvPr id="1603986936" name="Picture 1" descr="A screenshot of a computer screen&#10;&#10;AI-generated content may be incorrect."/>
                     <pic:cNvPicPr/>
                   </pic:nvPicPr>
                   <pic:blipFill>
@@ -5411,7 +5588,7 @@
                   <pic:spPr>
                     <a:xfrm>
                       <a:off x="0" y="0"/>
-                      <a:ext cx="4742495" cy="3717091"/>
+                      <a:ext cx="5731510" cy="4279265"/>
                     </a:xfrm>
                     <a:prstGeom prst="rect">
                       <a:avLst/>
@@ -5549,7 +5726,7 @@
       <w:pPr>
         <w:pStyle w:val="Heading3"/>
       </w:pPr>
-      <w:bookmarkStart w:id="13" w:name="_Toc189816932"/>
+      <w:bookmarkStart w:id="14" w:name="_Toc190072632"/>
       <w:proofErr w:type="spellStart"/>
       <w:r>
         <w:lastRenderedPageBreak/>
@@ -5558,10 +5735,16 @@
       <w:r>
         <w:t>ener.c</w:t>
       </w:r>
-      <w:bookmarkEnd w:id="13"/>
+      <w:bookmarkEnd w:id="14"/>
       <w:proofErr w:type="spellEnd"/>
     </w:p>
     <w:p>
+      <w:pPr>
+        <w:rPr>
+          <w:b/>
+          <w:bCs/>
+        </w:rPr>
+      </w:pPr>
       <w:r>
         <w:t xml:space="preserve">In </w:t>
       </w:r>
@@ -5576,6 +5759,15 @@
       <w:r>
         <w:t xml:space="preserve"> there are two </w:t>
       </w:r>
+      <w:r>
+        <w:rPr>
+          <w:b/>
+          <w:bCs/>
+        </w:rPr>
+        <w:t>functions:</w:t>
+      </w:r>
+    </w:p>
+    <w:p>
       <w:proofErr w:type="spellStart"/>
       <w:proofErr w:type="gramStart"/>
       <w:r>
@@ -5583,23 +5775,23 @@
           <w:b/>
           <w:bCs/>
         </w:rPr>
-        <w:t>functions:</w:t>
-      </w:r>
+        <w:t>userParameters</w:t>
+      </w:r>
+      <w:proofErr w:type="spellEnd"/>
       <w:r>
         <w:rPr>
           <w:b/>
           <w:bCs/>
         </w:rPr>
-        <w:t>userParameters</w:t>
-      </w:r>
-      <w:proofErr w:type="spellEnd"/>
+        <w:t>(</w:t>
+      </w:r>
       <w:proofErr w:type="gramEnd"/>
       <w:r>
         <w:rPr>
           <w:b/>
           <w:bCs/>
         </w:rPr>
-        <w:t>()</w:t>
+        <w:t>)</w:t>
       </w:r>
       <w:r>
         <w:t xml:space="preserve"> to prompt user, to validate inputs and to pass on values </w:t>
@@ -5617,10 +5809,10 @@
           <w:noProof/>
         </w:rPr>
         <w:drawing>
-          <wp:inline distT="0" distB="0" distL="0" distR="0" wp14:anchorId="0299AF60" wp14:editId="7ECF621D">
-            <wp:extent cx="2649870" cy="7966163"/>
-            <wp:effectExtent l="0" t="0" r="0" b="0"/>
-            <wp:docPr id="683758472" name="Picture 3" descr="A screenshot of a cell phone&#10;&#10;AI-generated content may be incorrect."/>
+          <wp:inline distT="0" distB="0" distL="0" distR="0" wp14:anchorId="0299AF60" wp14:editId="72FC40FB">
+            <wp:extent cx="4120854" cy="7688690"/>
+            <wp:effectExtent l="0" t="0" r="0" b="7620"/>
+            <wp:docPr id="683758472" name="Picture 3"/>
             <wp:cNvGraphicFramePr>
               <a:graphicFrameLocks xmlns:a="http://schemas.openxmlformats.org/drawingml/2006/main" noChangeAspect="1"/>
             </wp:cNvGraphicFramePr>
@@ -5628,7 +5820,7 @@
               <a:graphicData uri="http://schemas.openxmlformats.org/drawingml/2006/picture">
                 <pic:pic xmlns:pic="http://schemas.openxmlformats.org/drawingml/2006/picture">
                   <pic:nvPicPr>
-                    <pic:cNvPr id="683758472" name="Picture 3" descr="A screenshot of a cell phone&#10;&#10;AI-generated content may be incorrect."/>
+                    <pic:cNvPr id="683758472" name="Picture 3"/>
                     <pic:cNvPicPr/>
                   </pic:nvPicPr>
                   <pic:blipFill>
@@ -5646,7 +5838,7 @@
                   <pic:spPr>
                     <a:xfrm>
                       <a:off x="0" y="0"/>
-                      <a:ext cx="2686441" cy="8076104"/>
+                      <a:ext cx="4139437" cy="7723361"/>
                     </a:xfrm>
                     <a:prstGeom prst="rect">
                       <a:avLst/>
@@ -5682,15 +5874,18 @@
       </w:r>
     </w:p>
     <w:p>
+      <w:pPr>
+        <w:jc w:val="center"/>
+      </w:pPr>
       <w:r>
         <w:rPr>
           <w:noProof/>
         </w:rPr>
         <w:drawing>
-          <wp:inline distT="0" distB="0" distL="0" distR="0" wp14:anchorId="1EEC442B" wp14:editId="2B2FA28C">
-            <wp:extent cx="5731510" cy="6468745"/>
-            <wp:effectExtent l="0" t="0" r="2540" b="8255"/>
-            <wp:docPr id="894514669" name="Picture 4" descr="A diagram of a diagram&#10;&#10;AI-generated content may be incorrect."/>
+          <wp:inline distT="0" distB="0" distL="0" distR="0" wp14:anchorId="3A61D58A" wp14:editId="3122CD28">
+            <wp:extent cx="3746173" cy="8418786"/>
+            <wp:effectExtent l="0" t="0" r="6985" b="1905"/>
+            <wp:docPr id="679576299" name="Picture 2" descr="A screenshot of a computer screen&#10;&#10;AI-generated content may be incorrect."/>
             <wp:cNvGraphicFramePr>
               <a:graphicFrameLocks xmlns:a="http://schemas.openxmlformats.org/drawingml/2006/main" noChangeAspect="1"/>
             </wp:cNvGraphicFramePr>
@@ -5698,7 +5893,7 @@
               <a:graphicData uri="http://schemas.openxmlformats.org/drawingml/2006/picture">
                 <pic:pic xmlns:pic="http://schemas.openxmlformats.org/drawingml/2006/picture">
                   <pic:nvPicPr>
-                    <pic:cNvPr id="894514669" name="Picture 4" descr="A diagram of a diagram&#10;&#10;AI-generated content may be incorrect."/>
+                    <pic:cNvPr id="679576299" name="Picture 2" descr="A screenshot of a computer screen&#10;&#10;AI-generated content may be incorrect."/>
                     <pic:cNvPicPr/>
                   </pic:nvPicPr>
                   <pic:blipFill>
@@ -5716,7 +5911,7 @@
                   <pic:spPr>
                     <a:xfrm>
                       <a:off x="0" y="0"/>
-                      <a:ext cx="5731510" cy="6468745"/>
+                      <a:ext cx="3771591" cy="8475908"/>
                     </a:xfrm>
                     <a:prstGeom prst="rect">
                       <a:avLst/>
@@ -5733,8 +5928,9 @@
       <w:pPr>
         <w:pStyle w:val="Heading2"/>
       </w:pPr>
-      <w:bookmarkStart w:id="14" w:name="_Toc189816933"/>
-      <w:r>
+      <w:bookmarkStart w:id="15" w:name="_Toc190072633"/>
+      <w:r>
+        <w:lastRenderedPageBreak/>
         <w:t>Final</w:t>
       </w:r>
       <w:r>
@@ -5782,7 +5978,7 @@
       <w:r>
         <w:t>:</w:t>
       </w:r>
-      <w:bookmarkEnd w:id="14"/>
+      <w:bookmarkEnd w:id="15"/>
     </w:p>
     <w:p>
       <w:r>
@@ -5832,7 +6028,6 @@
           <w:szCs w:val="18"/>
         </w:rPr>
       </w:pPr>
-      <w:bookmarkStart w:id="15" w:name="_Toc189816934"/>
       <w:proofErr w:type="gramStart"/>
       <w:r>
         <w:rPr>
@@ -6730,7 +6925,6 @@
           <w:sz w:val="18"/>
           <w:szCs w:val="18"/>
         </w:rPr>
-        <w:lastRenderedPageBreak/>
         <w:t xml:space="preserve">        </w:t>
       </w:r>
       <w:r>
@@ -10558,6 +10752,7 @@
           <w:sz w:val="18"/>
           <w:szCs w:val="18"/>
         </w:rPr>
+        <w:lastRenderedPageBreak/>
         <w:t>void</w:t>
       </w:r>
       <w:r>
@@ -11901,7 +12096,6 @@
           <w:sz w:val="18"/>
           <w:szCs w:val="18"/>
         </w:rPr>
-        <w:lastRenderedPageBreak/>
         <w:t> </w:t>
       </w:r>
     </w:p>
@@ -16741,6 +16935,7 @@
           <w:sz w:val="18"/>
           <w:szCs w:val="18"/>
         </w:rPr>
+        <w:lastRenderedPageBreak/>
         <w:t xml:space="preserve">        result </w:t>
       </w:r>
       <w:r>
@@ -18373,7 +18568,6 @@
           <w:sz w:val="18"/>
           <w:szCs w:val="18"/>
         </w:rPr>
-        <w:lastRenderedPageBreak/>
         <w:t xml:space="preserve">    </w:t>
       </w:r>
       <w:r>
@@ -23578,6 +23772,7 @@
           <w:sz w:val="18"/>
           <w:szCs w:val="18"/>
         </w:rPr>
+        <w:lastRenderedPageBreak/>
         <w:t xml:space="preserve">        </w:t>
       </w:r>
       <w:proofErr w:type="spellStart"/>
@@ -25506,10 +25701,11 @@
       <w:pPr>
         <w:pStyle w:val="Heading2"/>
       </w:pPr>
+      <w:bookmarkStart w:id="16" w:name="_Toc190072634"/>
       <w:r>
         <w:t>Challenges faced</w:t>
       </w:r>
-      <w:bookmarkEnd w:id="15"/>
+      <w:bookmarkEnd w:id="16"/>
     </w:p>
     <w:p>
       <w:pPr>
@@ -25647,11 +25843,11 @@
       <w:pPr>
         <w:pStyle w:val="Heading2"/>
       </w:pPr>
-      <w:bookmarkStart w:id="16" w:name="_Toc189816935"/>
+      <w:bookmarkStart w:id="17" w:name="_Toc190072635"/>
       <w:r>
         <w:t>Changes from Mini Project</w:t>
       </w:r>
-      <w:bookmarkEnd w:id="16"/>
+      <w:bookmarkEnd w:id="17"/>
     </w:p>
     <w:p>
       <w:pPr>
@@ -25735,14 +25931,20 @@
       </w:r>
     </w:p>
     <w:p>
+      <w:r>
+        <w:br w:type="page"/>
+      </w:r>
+    </w:p>
+    <w:p>
       <w:pPr>
         <w:pStyle w:val="Heading1"/>
       </w:pPr>
-      <w:bookmarkStart w:id="17" w:name="_Toc189816936"/>
-      <w:r>
+      <w:bookmarkStart w:id="18" w:name="_Toc190072636"/>
+      <w:r>
+        <w:lastRenderedPageBreak/>
         <w:t>Results</w:t>
       </w:r>
-      <w:bookmarkEnd w:id="17"/>
+      <w:bookmarkEnd w:id="18"/>
     </w:p>
     <w:p>
       <w:pPr>
@@ -26210,12 +26412,12 @@
       <w:pPr>
         <w:pStyle w:val="Heading1"/>
       </w:pPr>
-      <w:bookmarkStart w:id="18" w:name="_Toc189816937"/>
+      <w:bookmarkStart w:id="19" w:name="_Toc190072637"/>
       <w:r>
         <w:lastRenderedPageBreak/>
         <w:t>Discussion</w:t>
       </w:r>
-      <w:bookmarkEnd w:id="18"/>
+      <w:bookmarkEnd w:id="19"/>
     </w:p>
     <w:p>
       <w:pPr>
@@ -26374,7 +26576,273 @@
         <w:t xml:space="preserve"> user-friendly interface with clear prompts and outputs simplifies the simulation of Zener diode voltage regulation.</w:t>
       </w:r>
     </w:p>
-    <w:bookmarkStart w:id="19" w:name="_Toc189816938" w:displacedByCustomXml="next"/>
+    <w:p>
+      <w:pPr>
+        <w:pStyle w:val="Heading1"/>
+      </w:pPr>
+      <w:bookmarkStart w:id="20" w:name="_Toc190072638"/>
+      <w:r>
+        <w:t>GitHub</w:t>
+      </w:r>
+      <w:bookmarkEnd w:id="20"/>
+      <w:r>
+        <w:t xml:space="preserve"> </w:t>
+      </w:r>
+    </w:p>
+    <w:p>
+      <w:r>
+        <w:rPr>
+          <w:b/>
+          <w:bCs/>
+        </w:rPr>
+        <w:t>QR code</w:t>
+      </w:r>
+      <w:r>
+        <w:t xml:space="preserve"> and </w:t>
+      </w:r>
+      <w:r>
+        <w:rPr>
+          <w:b/>
+          <w:bCs/>
+        </w:rPr>
+        <w:t>Link</w:t>
+      </w:r>
+      <w:r>
+        <w:t xml:space="preserve"> for </w:t>
+      </w:r>
+      <w:r>
+        <w:rPr>
+          <w:b/>
+          <w:bCs/>
+        </w:rPr>
+        <w:t>GitHub Repository</w:t>
+      </w:r>
+      <w:r>
+        <w:t xml:space="preserve"> for this project:</w:t>
+      </w:r>
+    </w:p>
+    <w:p>
+      <w:r>
+        <w:drawing>
+          <wp:anchor distT="0" distB="0" distL="114300" distR="114300" simplePos="0" relativeHeight="251662336" behindDoc="1" locked="0" layoutInCell="1" allowOverlap="1" wp14:anchorId="7BE0A526" wp14:editId="2C0C3816">
+            <wp:simplePos x="0" y="0"/>
+            <wp:positionH relativeFrom="column">
+              <wp:posOffset>1710046</wp:posOffset>
+            </wp:positionH>
+            <wp:positionV relativeFrom="paragraph">
+              <wp:posOffset>303383</wp:posOffset>
+            </wp:positionV>
+            <wp:extent cx="4108215" cy="1934284"/>
+            <wp:effectExtent l="0" t="0" r="6985" b="8890"/>
+            <wp:wrapNone/>
+            <wp:docPr id="1817851195" name="Picture 1" descr="A screenshot of a computer&#10;&#10;AI-generated content may be incorrect."/>
+            <wp:cNvGraphicFramePr>
+              <a:graphicFrameLocks xmlns:a="http://schemas.openxmlformats.org/drawingml/2006/main" noChangeAspect="1"/>
+            </wp:cNvGraphicFramePr>
+            <a:graphic xmlns:a="http://schemas.openxmlformats.org/drawingml/2006/main">
+              <a:graphicData uri="http://schemas.openxmlformats.org/drawingml/2006/picture">
+                <pic:pic xmlns:pic="http://schemas.openxmlformats.org/drawingml/2006/picture">
+                  <pic:nvPicPr>
+                    <pic:cNvPr id="1817851195" name="Picture 1" descr="A screenshot of a computer&#10;&#10;AI-generated content may be incorrect."/>
+                    <pic:cNvPicPr/>
+                  </pic:nvPicPr>
+                  <pic:blipFill>
+                    <a:blip r:embed="rId22">
+                      <a:extLst>
+                        <a:ext uri="{28A0092B-C50C-407E-A947-70E740481C1C}">
+                          <a14:useLocalDpi xmlns:a14="http://schemas.microsoft.com/office/drawing/2010/main" val="0"/>
+                        </a:ext>
+                      </a:extLst>
+                    </a:blip>
+                    <a:stretch>
+                      <a:fillRect/>
+                    </a:stretch>
+                  </pic:blipFill>
+                  <pic:spPr>
+                    <a:xfrm>
+                      <a:off x="0" y="0"/>
+                      <a:ext cx="4117459" cy="1938636"/>
+                    </a:xfrm>
+                    <a:prstGeom prst="rect">
+                      <a:avLst/>
+                    </a:prstGeom>
+                  </pic:spPr>
+                </pic:pic>
+              </a:graphicData>
+            </a:graphic>
+            <wp14:sizeRelH relativeFrom="margin">
+              <wp14:pctWidth>0</wp14:pctWidth>
+            </wp14:sizeRelH>
+            <wp14:sizeRelV relativeFrom="margin">
+              <wp14:pctHeight>0</wp14:pctHeight>
+            </wp14:sizeRelV>
+          </wp:anchor>
+        </w:drawing>
+      </w:r>
+      <w:r>
+        <w:t xml:space="preserve"> </w:t>
+      </w:r>
+      <w:hyperlink r:id="rId23" w:history="1">
+        <w:r>
+          <w:rPr>
+            <w:rStyle w:val="Hyperlink"/>
+          </w:rPr>
+          <w:t>https://github.com/sakSambo/Final-Project</w:t>
+        </w:r>
+      </w:hyperlink>
+    </w:p>
+    <w:p>
+      <w:r>
+        <w:rPr>
+          <w:noProof/>
+        </w:rPr>
+        <w:drawing>
+          <wp:anchor distT="0" distB="0" distL="114300" distR="114300" simplePos="0" relativeHeight="251661312" behindDoc="1" locked="0" layoutInCell="1" allowOverlap="1" wp14:anchorId="2498B0F9" wp14:editId="247A8AC8">
+            <wp:simplePos x="0" y="0"/>
+            <wp:positionH relativeFrom="column">
+              <wp:posOffset>-40005</wp:posOffset>
+            </wp:positionH>
+            <wp:positionV relativeFrom="page">
+              <wp:posOffset>4459226</wp:posOffset>
+            </wp:positionV>
+            <wp:extent cx="1738498" cy="1738498"/>
+            <wp:effectExtent l="19050" t="19050" r="14605" b="14605"/>
+            <wp:wrapNone/>
+            <wp:docPr id="688466719" name="Picture 1" descr="A qr code with a lion head&#10;&#10;AI-generated content may be incorrect."/>
+            <wp:cNvGraphicFramePr>
+              <a:graphicFrameLocks xmlns:a="http://schemas.openxmlformats.org/drawingml/2006/main" noChangeAspect="1"/>
+            </wp:cNvGraphicFramePr>
+            <a:graphic xmlns:a="http://schemas.openxmlformats.org/drawingml/2006/main">
+              <a:graphicData uri="http://schemas.openxmlformats.org/drawingml/2006/picture">
+                <pic:pic xmlns:pic="http://schemas.openxmlformats.org/drawingml/2006/picture">
+                  <pic:nvPicPr>
+                    <pic:cNvPr id="688466719" name="Picture 1" descr="A qr code with a lion head&#10;&#10;AI-generated content may be incorrect."/>
+                    <pic:cNvPicPr/>
+                  </pic:nvPicPr>
+                  <pic:blipFill>
+                    <a:blip r:embed="rId24" cstate="print">
+                      <a:extLst>
+                        <a:ext uri="{28A0092B-C50C-407E-A947-70E740481C1C}">
+                          <a14:useLocalDpi xmlns:a14="http://schemas.microsoft.com/office/drawing/2010/main" val="0"/>
+                        </a:ext>
+                      </a:extLst>
+                    </a:blip>
+                    <a:stretch>
+                      <a:fillRect/>
+                    </a:stretch>
+                  </pic:blipFill>
+                  <pic:spPr>
+                    <a:xfrm>
+                      <a:off x="0" y="0"/>
+                      <a:ext cx="1738498" cy="1738498"/>
+                    </a:xfrm>
+                    <a:prstGeom prst="rect">
+                      <a:avLst/>
+                    </a:prstGeom>
+                    <a:ln>
+                      <a:solidFill>
+                        <a:schemeClr val="tx1"/>
+                      </a:solidFill>
+                    </a:ln>
+                  </pic:spPr>
+                </pic:pic>
+              </a:graphicData>
+            </a:graphic>
+            <wp14:sizeRelH relativeFrom="margin">
+              <wp14:pctWidth>0</wp14:pctWidth>
+            </wp14:sizeRelH>
+            <wp14:sizeRelV relativeFrom="margin">
+              <wp14:pctHeight>0</wp14:pctHeight>
+            </wp14:sizeRelV>
+          </wp:anchor>
+        </w:drawing>
+      </w:r>
+    </w:p>
+    <w:p/>
+    <w:p/>
+    <w:p/>
+    <w:p>
+      <w:r>
+        <w:rPr>
+          <w:noProof/>
+        </w:rPr>
+        <mc:AlternateContent>
+          <mc:Choice Requires="wps">
+            <w:drawing>
+              <wp:anchor distT="0" distB="0" distL="114300" distR="114300" simplePos="0" relativeHeight="251663360" behindDoc="0" locked="0" layoutInCell="1" allowOverlap="1" wp14:anchorId="775B3C85" wp14:editId="1500CB73">
+                <wp:simplePos x="0" y="0"/>
+                <wp:positionH relativeFrom="column">
+                  <wp:posOffset>2612571</wp:posOffset>
+                </wp:positionH>
+                <wp:positionV relativeFrom="paragraph">
+                  <wp:posOffset>15050</wp:posOffset>
+                </wp:positionV>
+                <wp:extent cx="403761" cy="154380"/>
+                <wp:effectExtent l="0" t="0" r="15875" b="17145"/>
+                <wp:wrapNone/>
+                <wp:docPr id="1834763145" name="Rectangle 3"/>
+                <wp:cNvGraphicFramePr/>
+                <a:graphic xmlns:a="http://schemas.openxmlformats.org/drawingml/2006/main">
+                  <a:graphicData uri="http://schemas.microsoft.com/office/word/2010/wordprocessingShape">
+                    <wps:wsp>
+                      <wps:cNvSpPr/>
+                      <wps:spPr>
+                        <a:xfrm>
+                          <a:off x="0" y="0"/>
+                          <a:ext cx="403761" cy="154380"/>
+                        </a:xfrm>
+                        <a:prstGeom prst="rect">
+                          <a:avLst/>
+                        </a:prstGeom>
+                        <a:solidFill>
+                          <a:schemeClr val="bg1"/>
+                        </a:solidFill>
+                        <a:ln>
+                          <a:solidFill>
+                            <a:schemeClr val="bg1"/>
+                          </a:solidFill>
+                        </a:ln>
+                      </wps:spPr>
+                      <wps:style>
+                        <a:lnRef idx="2">
+                          <a:schemeClr val="accent1">
+                            <a:shade val="15000"/>
+                          </a:schemeClr>
+                        </a:lnRef>
+                        <a:fillRef idx="1">
+                          <a:schemeClr val="accent1"/>
+                        </a:fillRef>
+                        <a:effectRef idx="0">
+                          <a:schemeClr val="accent1"/>
+                        </a:effectRef>
+                        <a:fontRef idx="minor">
+                          <a:schemeClr val="lt1"/>
+                        </a:fontRef>
+                      </wps:style>
+                      <wps:bodyPr rot="0" spcFirstLastPara="0" vertOverflow="overflow" horzOverflow="overflow" vert="horz" wrap="square" lIns="91440" tIns="45720" rIns="91440" bIns="45720" numCol="1" spcCol="0" rtlCol="0" fromWordArt="0" anchor="ctr" anchorCtr="0" forceAA="0" compatLnSpc="1">
+                        <a:prstTxWarp prst="textNoShape">
+                          <a:avLst/>
+                        </a:prstTxWarp>
+                        <a:noAutofit/>
+                      </wps:bodyPr>
+                    </wps:wsp>
+                  </a:graphicData>
+                </a:graphic>
+              </wp:anchor>
+            </w:drawing>
+          </mc:Choice>
+          <mc:Fallback>
+            <w:pict>
+              <v:rect w14:anchorId="33B1574E" id="Rectangle 3" o:spid="_x0000_s1026" style="position:absolute;margin-left:205.7pt;margin-top:1.2pt;width:31.8pt;height:12.15pt;z-index:251663360;visibility:visible;mso-wrap-style:square;mso-wrap-distance-left:9pt;mso-wrap-distance-top:0;mso-wrap-distance-right:9pt;mso-wrap-distance-bottom:0;mso-position-horizontal:absolute;mso-position-horizontal-relative:text;mso-position-vertical:absolute;mso-position-vertical-relative:text;v-text-anchor:middle" o:gfxdata="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" fillcolor="white [3212]" strokecolor="white [3212]" strokeweight="1pt"/>
+            </w:pict>
+          </mc:Fallback>
+        </mc:AlternateContent>
+      </w:r>
+    </w:p>
+    <w:p/>
+    <w:p/>
+    <w:p/>
+    <w:bookmarkStart w:id="21" w:name="_Toc190072639" w:displacedByCustomXml="next"/>
     <w:sdt>
       <w:sdtPr>
         <w:rPr>
@@ -26396,7 +26864,7 @@
           <w:r>
             <w:t>References</w:t>
           </w:r>
-          <w:bookmarkEnd w:id="19"/>
+          <w:bookmarkEnd w:id="21"/>
         </w:p>
         <w:sdt>
           <w:sdtPr>
@@ -26557,7 +27025,7 @@
       </w:sdtContent>
     </w:sdt>
     <w:sectPr>
-      <w:footerReference w:type="default" r:id="rId22"/>
+      <w:footerReference w:type="default" r:id="rId25"/>
       <w:pgSz w:w="11906" w:h="16838" w:code="9"/>
       <w:pgMar w:top="1440" w:right="1440" w:bottom="1440" w:left="1440" w:header="720" w:footer="720" w:gutter="0"/>
       <w:pgNumType w:start="1"/>
@@ -30229,6 +30697,18 @@
     <w:unhideWhenUsed/>
     <w:rsid w:val="0060194B"/>
   </w:style>
+  <w:style w:type="character" w:styleId="UnresolvedMention">
+    <w:name w:val="Unresolved Mention"/>
+    <w:basedOn w:val="DefaultParagraphFont"/>
+    <w:uiPriority w:val="99"/>
+    <w:semiHidden/>
+    <w:unhideWhenUsed/>
+    <w:rsid w:val="0080665E"/>
+    <w:rPr>
+      <w:color w:val="605E5C"/>
+      <w:shd w:val="clear" w:color="auto" w:fill="E1DFDD"/>
+    </w:rPr>
+  </w:style>
 </w:styles>
 </file>
 

</xml_diff>